<commit_message>
javitas az architektura doksiban
</commit_message>
<xml_diff>
--- a/doc/frontend_architektura/frontend_architektura_helyes.docx
+++ b/doc/frontend_architektura/frontend_architektura_helyes.docx
@@ -3888,7 +3888,13 @@
       </w:r>
       <w:proofErr w:type="spellStart"/>
       <w:r>
-        <w:t>formterületet</w:t>
+        <w:t>form</w:t>
+      </w:r>
+      <w:r>
+        <w:t>o</w:t>
+      </w:r>
+      <w:r>
+        <w:t>t</w:t>
       </w:r>
       <w:proofErr w:type="spellEnd"/>
       <w:r>
@@ -4108,13 +4114,11 @@
       <w:r>
         <w:t xml:space="preserve"> egy </w:t>
       </w:r>
-      <w:proofErr w:type="spellStart"/>
-      <w:r>
-        <w:t>formterületet</w:t>
-      </w:r>
-      <w:proofErr w:type="spellEnd"/>
-      <w:r>
-        <w:t xml:space="preserve"> tájékoztató szöveggel, egy e-mail beviteli mezővel és egy küldési gombbal. A gomb megnyomásakor a </w:t>
+      <w:r>
+        <w:t>űrlapo</w:t>
+      </w:r>
+      <w:r>
+        <w:t xml:space="preserve">t tájékoztató szöveggel, egy e-mail beviteli mezővel és egy küldési gombbal. A gomb megnyomásakor a </w:t>
       </w:r>
       <w:proofErr w:type="spellStart"/>
       <w:r>

</xml_diff>